<commit_message>
Module 13: confirm Joined rows print, update screenshot and Word evidence
Co-Authored-By: Claude Opus 5.5 <noreply@anthropic.com>
Claude-Session: https://claude.ai/code/session_01HhHvdYUcVk6Egtq1BBM6AL
</commit_message>
<xml_diff>
--- a/13_Data transformation SparkSQL Databricks/Screenshots.docx
+++ b/13_Data transformation SparkSQL Databricks/Screenshots.docx
@@ -2143,7 +2143,7 @@
         </w:rPr>
         <w:drawing>
           <wp:inline distT="0" distB="0" distL="0" distR="0" wp14:anchorId="5018C062" wp14:editId="15ABB239">
-            <wp:extent cx="3205622" cy="1619250"/>
+            <wp:extent cx="3205622" cy="1874055"/>
             <wp:effectExtent l="0" t="0" r="0" b="0"/>
             <wp:docPr id="33" name="Imagen 33"/>
             <wp:cNvGraphicFramePr>
@@ -2165,7 +2165,7 @@
                   <pic:spPr>
                     <a:xfrm>
                       <a:off x="0" y="0"/>
-                      <a:ext cx="3209481" cy="1621199"/>
+                      <a:ext cx="3209481" cy="1874055"/>
                     </a:xfrm>
                     <a:prstGeom prst="rect">
                       <a:avLst/>

</xml_diff>